<commit_message>
Start a series of essays on the project
</commit_message>
<xml_diff>
--- a/documentation/Why I built a talk show.docx
+++ b/documentation/Why I built a talk show.docx
@@ -1,6 +1,6 @@
 
 <file path=word/document.xml><?xml version="1.0" encoding="utf-8"?>
-<w:document xmlns:wpc="http://schemas.microsoft.com/office/word/2010/wordprocessingCanvas" xmlns:cx="http://schemas.microsoft.com/office/drawing/2014/chartex" xmlns:cx1="http://schemas.microsoft.com/office/drawing/2015/9/8/chartex" xmlns:cx2="http://schemas.microsoft.com/office/drawing/2015/10/21/chartex" xmlns:cx3="http://schemas.microsoft.com/office/drawing/2016/5/9/chartex" xmlns:cx4="http://schemas.microsoft.com/office/drawing/2016/5/10/chartex" xmlns:cx5="http://schemas.microsoft.com/office/drawing/2016/5/11/chartex" xmlns:cx6="http://schemas.microsoft.com/office/drawing/2016/5/12/chartex" xmlns:cx7="http://schemas.microsoft.com/office/drawing/2016/5/13/chartex" xmlns:cx8="http://schemas.microsoft.com/office/drawing/2016/5/14/chartex" xmlns:mc="http://schemas.openxmlformats.org/markup-compatibility/2006" xmlns:aink="http://schemas.microsoft.com/office/drawing/2016/ink" xmlns:am3d="http://schemas.microsoft.com/office/drawing/2017/model3d" xmlns:o="urn:schemas-microsoft-com:office:office" xmlns:oel="http://schemas.microsoft.com/office/2019/extlst" xmlns:r="http://schemas.openxmlformats.org/officeDocument/2006/relationships" xmlns:m="http://schemas.openxmlformats.org/officeDocument/2006/math" xmlns:v="urn:schemas-microsoft-com:vml" xmlns:wp14="http://schemas.microsoft.com/office/word/2010/wordprocessingDrawing" xmlns:wp="http://schemas.openxmlformats.org/drawingml/2006/wordprocessingDrawing" xmlns:w10="urn:schemas-microsoft-com:office:word" xmlns:w="http://schemas.openxmlformats.org/wordprocessingml/2006/main" xmlns:w14="http://schemas.microsoft.com/office/word/2010/wordml" xmlns:w15="http://schemas.microsoft.com/office/word/2012/wordml" xmlns:w16cex="http://schemas.microsoft.com/office/word/2018/wordml/cex" xmlns:w16cid="http://schemas.microsoft.com/office/word/2016/wordml/cid" xmlns:w16="http://schemas.microsoft.com/office/word/2018/wordml" xmlns:w16du="http://schemas.microsoft.com/office/word/2023/wordml/word16du" xmlns:w16sdtdh="http://schemas.microsoft.com/office/word/2020/wordml/sdtdatahash" xmlns:w16sdtfl="http://schemas.microsoft.com/office/word/2024/wordml/sdtformatlock" xmlns:w16se="http://schemas.microsoft.com/office/word/2015/wordml/symex" xmlns:wpg="http://schemas.microsoft.com/office/word/2010/wordprocessingGroup" xmlns:wpi="http://schemas.microsoft.com/office/word/2010/wordprocessingInk" xmlns:wne="http://schemas.microsoft.com/office/word/2006/wordml" xmlns:wps="http://schemas.microsoft.com/office/word/2010/wordprocessingShape" mc:Ignorable="w14 w15 w16se w16cid w16 w16cex w16sdtdh w16sdtfl w16du wp14">
+<w:document xmlns:wpc="http://schemas.microsoft.com/office/word/2010/wordprocessingCanvas" xmlns:cx="http://schemas.microsoft.com/office/drawing/2014/chartex" xmlns:cx1="http://schemas.microsoft.com/office/drawing/2015/9/8/chartex" xmlns:cx2="http://schemas.microsoft.com/office/drawing/2015/10/21/chartex" xmlns:cx3="http://schemas.microsoft.com/office/drawing/2016/5/9/chartex" xmlns:cx4="http://schemas.microsoft.com/office/drawing/2016/5/10/chartex" xmlns:cx5="http://schemas.microsoft.com/office/drawing/2016/5/11/chartex" xmlns:cx6="http://schemas.microsoft.com/office/drawing/2016/5/12/chartex" xmlns:cx7="http://schemas.microsoft.com/office/drawing/2016/5/13/chartex" xmlns:cx8="http://schemas.microsoft.com/office/drawing/2016/5/14/chartex" xmlns:mc="http://schemas.openxmlformats.org/markup-compatibility/2006" xmlns:aink="http://schemas.microsoft.com/office/drawing/2016/ink" xmlns:am3d="http://schemas.microsoft.com/office/drawing/2017/model3d" xmlns:o="urn:schemas-microsoft-com:office:office" xmlns:oel="http://schemas.microsoft.com/office/2019/extlst" xmlns:r="http://schemas.openxmlformats.org/officeDocument/2006/relationships" xmlns:m="http://schemas.openxmlformats.org/officeDocument/2006/math" xmlns:v="urn:schemas-microsoft-com:vml" xmlns:wp14="http://schemas.microsoft.com/office/word/2010/wordprocessingDrawing" xmlns:wp="http://schemas.openxmlformats.org/drawingml/2006/wordprocessingDrawing" xmlns:w10="urn:schemas-microsoft-com:office:word" xmlns:w="http://schemas.openxmlformats.org/wordprocessingml/2006/main" xmlns:w14="http://schemas.microsoft.com/office/word/2010/wordml" xmlns:w15="http://schemas.microsoft.com/office/word/2012/wordml" xmlns:w16cei="http://schemas.microsoft.com/office/word/2026/wordml/cei" xmlns:w16cex="http://schemas.microsoft.com/office/word/2018/wordml/cex" xmlns:w16cid="http://schemas.microsoft.com/office/word/2016/wordml/cid" xmlns:w16="http://schemas.microsoft.com/office/word/2018/wordml" xmlns:w16du="http://schemas.microsoft.com/office/word/2023/wordml/word16du" xmlns:w16sdtdh="http://schemas.microsoft.com/office/word/2020/wordml/sdtdatahash" xmlns:w16sdtfl="http://schemas.microsoft.com/office/word/2024/wordml/sdtformatlock" xmlns:w16se="http://schemas.microsoft.com/office/word/2015/wordml/symex" xmlns:wpg="http://schemas.microsoft.com/office/word/2010/wordprocessingGroup" xmlns:wpi="http://schemas.microsoft.com/office/word/2010/wordprocessingInk" xmlns:wne="http://schemas.microsoft.com/office/word/2006/wordml" xmlns:wps="http://schemas.microsoft.com/office/word/2010/wordprocessingShape" mc:Ignorable="w14 w15 w16se w16cid w16 w16cex w16sdtdh w16sdtfl w16du wp14">
   <w:body>
     <w:p>
       <w:pPr>
@@ -105,7 +105,19 @@
     </w:p>
     <w:p>
       <w:r>
-        <w:t>For the next two days I was glued to the map except for when I looked over his shoulder to check the odometer.</w:t>
+        <w:t xml:space="preserve">For the next two days </w:t>
+      </w:r>
+      <w:r>
+        <w:t>we were</w:t>
+      </w:r>
+      <w:r>
+        <w:t xml:space="preserve"> glued to the map except for when </w:t>
+      </w:r>
+      <w:r>
+        <w:t>we</w:t>
+      </w:r>
+      <w:r>
+        <w:t xml:space="preserve"> looked over his shoulder to check the odometer.</w:t>
       </w:r>
     </w:p>
     <w:p>
@@ -169,10 +181,49 @@
       <w:r>
         <w:t xml:space="preserve">His classic case study is to compare a Map to a GPS system. Both are tools for getting you from one place to another, but one (the map) gives you a way to develop an understanding of a city (or a highway system in the United States) in a way that a GPS doesn’t. Following the instructions of the GPS – “Turn left in 500 feet” doesn’t contribute to your understanding in the same way. </w:t>
       </w:r>
-    </w:p>
-    <w:p>
-      <w:r>
-        <w:t>The downside of the competitive artifacts in his view, is that they are prone to promoting atrophy of certain important capabilities in us. -- This theory rings true in certain ways.</w:t>
+      <w:r>
+        <w:t xml:space="preserve">My father new the value of having a mastery of the bigger picture the map gives us. He could have gotten us there </w:t>
+      </w:r>
+      <w:proofErr w:type="gramStart"/>
+      <w:r>
+        <w:t>himself</w:t>
+      </w:r>
+      <w:proofErr w:type="gramEnd"/>
+      <w:r>
+        <w:t xml:space="preserve"> but he wanted us to have that skill. </w:t>
+      </w:r>
+    </w:p>
+    <w:p>
+      <w:r>
+        <w:t xml:space="preserve">The downside of the competitive artifacts in his </w:t>
+      </w:r>
+      <w:r>
+        <w:t>Krakauer’s view</w:t>
+      </w:r>
+      <w:r>
+        <w:t xml:space="preserve">, is that they are </w:t>
+      </w:r>
+      <w:r>
+        <w:t>given</w:t>
+      </w:r>
+      <w:r>
+        <w:t xml:space="preserve"> to </w:t>
+      </w:r>
+      <w:proofErr w:type="gramStart"/>
+      <w:r>
+        <w:t>promoting</w:t>
+      </w:r>
+      <w:proofErr w:type="gramEnd"/>
+      <w:r>
+        <w:t xml:space="preserve"> atrophy of certain important capabilities in us. </w:t>
+      </w:r>
+      <w:r>
+        <w:t>This theory rings true in some ways.</w:t>
+      </w:r>
+    </w:p>
+    <w:p>
+      <w:r>
+        <w:t xml:space="preserve">GPS didn’t exist at the time our family took that trip, but I don’t think Dad would have let us use it if it did. </w:t>
       </w:r>
     </w:p>
     <w:p>
@@ -192,7 +243,13 @@
         <w:t xml:space="preserve">work with them. A calculator can be used in such a way as to degrade our ability to do simple math. It also can be used as a check on our calculations or </w:t>
       </w:r>
       <w:r>
-        <w:t xml:space="preserve">speed our calculation of problems that we know how to perform but are tedious. No one thinks the engineers at NASA on the Apollo missions didn’t know how to do math, yet they took advantage of computers to solve a greater meta-problem. </w:t>
+        <w:t>speed our calculation of problems that we know how to perform but are tedious. No one thinks the engineers at NASA on the Apollo missions didn’t know how to do math, yet they took advantage of computers to solve a greater meta-problem</w:t>
+      </w:r>
+      <w:r>
+        <w:t xml:space="preserve"> more quickly with potentially greater accuracy</w:t>
+      </w:r>
+      <w:r>
+        <w:t xml:space="preserve">. </w:t>
       </w:r>
     </w:p>
     <w:p>
@@ -203,7 +260,19 @@
         <w:t xml:space="preserve">seems </w:t>
       </w:r>
       <w:r>
-        <w:t>to aim at LLMs as competitive artifacts. I can see how in the way people generally use them, this can be true. However, is that more a question of the nature of the tool or how we use it? How might we use it in a way that makes LLMs more compl</w:t>
+        <w:t>to</w:t>
+      </w:r>
+      <w:r>
+        <w:t xml:space="preserve"> take</w:t>
+      </w:r>
+      <w:r>
+        <w:t xml:space="preserve"> aim at LLMs as competitive artifacts. I can see how</w:t>
+      </w:r>
+      <w:r>
+        <w:t>,</w:t>
+      </w:r>
+      <w:r>
+        <w:t xml:space="preserve"> in the way people generally use them, this can be true. However, is that more a question of the nature of the tool or how we use it? How might we use it in a way that makes LLMs more compl</w:t>
       </w:r>
       <w:r>
         <w:t>e</w:t>
@@ -214,6 +283,7 @@
     </w:p>
     <w:p>
       <w:r>
+        <w:lastRenderedPageBreak/>
         <w:t xml:space="preserve">The problem, I think, is that we’ve made these systems too “smooth” in our common use cases. We might need more “roughness” to bring out the potential. </w:t>
       </w:r>
     </w:p>
@@ -226,7 +296,6 @@
         </w:numPr>
       </w:pPr>
       <w:r>
-        <w:lastRenderedPageBreak/>
         <w:t xml:space="preserve">The </w:t>
       </w:r>
       <w:r>
@@ -254,21 +323,21 @@
       </w:r>
       <w:proofErr w:type="gramEnd"/>
       <w:r>
-        <w:t xml:space="preserve">” “Ding!” and the sign flips to show the answer. Points awarded or not based on a guess by a contestant. The goal? To guess the most popular answer to a question posed by the surveyor. In other words, to be the most statistically average. </w:t>
-      </w:r>
-      <w:r>
-        <w:t>Pursuing</w:t>
-      </w:r>
-      <w:r>
-        <w:t xml:space="preserve"> the </w:t>
-      </w:r>
-      <w:proofErr w:type="gramStart"/>
-      <w:r>
-        <w:t>median</w:t>
-      </w:r>
-      <w:proofErr w:type="gramEnd"/>
-      <w:r>
-        <w:t xml:space="preserve"> as the rewarding path. We’ve done this with our LLMs. </w:t>
+        <w:t>” “Ding!” and the sign flips to show the answer. Points awarded or not based on a guess by a contestant. The goal? To guess the most popular answer to a question posed by the surveyor. In other words, to be the most statistically average</w:t>
+      </w:r>
+      <w:r>
+        <w:t xml:space="preserve"> respondent -- p</w:t>
+      </w:r>
+      <w:r>
+        <w:t>ursuing</w:t>
+      </w:r>
+      <w:r>
+        <w:t xml:space="preserve"> the median as the rewarding path. </w:t>
+      </w:r>
+    </w:p>
+    <w:p>
+      <w:r>
+        <w:t xml:space="preserve">We’ve done this with our LLMs. </w:t>
       </w:r>
     </w:p>
     <w:p>
@@ -291,30 +360,66 @@
         <w:t>genius</w:t>
       </w:r>
       <w:r>
-        <w:t xml:space="preserve"> and the banal. The problem is there is a lot more banal than </w:t>
+        <w:t xml:space="preserve"> and the banal. </w:t>
+      </w:r>
+      <w:r>
+        <w:t>A</w:t>
+      </w:r>
+      <w:r>
+        <w:t xml:space="preserve"> problem </w:t>
+      </w:r>
+      <w:r>
+        <w:t xml:space="preserve">can be that there </w:t>
+      </w:r>
+      <w:r>
+        <w:t xml:space="preserve">is there is a lot more banal than </w:t>
       </w:r>
       <w:r>
         <w:t>genius</w:t>
       </w:r>
       <w:r>
+        <w:t>…</w:t>
+      </w:r>
+      <w:r>
+        <w:t xml:space="preserve"> </w:t>
+      </w:r>
+    </w:p>
+    <w:p>
+      <w:r>
+        <w:t xml:space="preserve">In some sense, </w:t>
+      </w:r>
+      <w:r>
+        <w:t xml:space="preserve">a </w:t>
+      </w:r>
+      <w:r>
+        <w:t>banal</w:t>
+      </w:r>
+      <w:r>
+        <w:t xml:space="preserve"> response</w:t>
+      </w:r>
+      <w:r>
+        <w:t xml:space="preserve"> is eas</w:t>
+      </w:r>
+      <w:r>
+        <w:t>ier</w:t>
+      </w:r>
+      <w:r>
+        <w:t>. It is nonconfrontational</w:t>
+      </w:r>
+      <w:r>
+        <w:t xml:space="preserve"> and</w:t>
+      </w:r>
+      <w:r>
+        <w:t xml:space="preserve"> “smooth”</w:t>
+      </w:r>
+      <w:r>
+        <w:t>; seeking to generate approval from the user</w:t>
+      </w:r>
+      <w:r>
         <w:t xml:space="preserve">. </w:t>
       </w:r>
-    </w:p>
-    <w:p>
-      <w:r>
-        <w:t>In some sense, the banal is easy. It is nonconfrontational</w:t>
-      </w:r>
-      <w:r>
-        <w:t xml:space="preserve"> and</w:t>
-      </w:r>
-      <w:r>
-        <w:t xml:space="preserve"> “smooth” in some way. “Well, everybody knows…”</w:t>
-      </w:r>
-      <w:r>
-        <w:t xml:space="preserve"> Is a sentence that should invite challenge, not agreement.</w:t>
-      </w:r>
-      <w:r>
-        <w:t xml:space="preserve"> In my experience, interactions with LLMs tend to drift towards the average in their recommendations for changes when doing something like enlisting them to assist in document preparation. There seems to be a real push against quirkiness / edginess. </w:t>
+      <w:r>
+        <w:t xml:space="preserve">In my experience, interactions with LLMs tend to drift towards the average in their recommendations for changes when doing something like enlisting them to assist in document preparation. There seems to be a real push against quirkiness / edginess. </w:t>
       </w:r>
     </w:p>
     <w:p>
@@ -430,39 +535,12 @@
         </w:numPr>
       </w:pPr>
       <w:r>
-        <w:t>Our Blind Spot</w:t>
-      </w:r>
-    </w:p>
-    <w:p>
-      <w:r>
-        <w:t>W</w:t>
-      </w:r>
-      <w:r>
-        <w:t xml:space="preserve">e are </w:t>
-      </w:r>
-      <w:r>
-        <w:t>“</w:t>
-      </w:r>
-      <w:r>
-        <w:t xml:space="preserve">playing to </w:t>
-      </w:r>
-      <w:r>
-        <w:t xml:space="preserve">not </w:t>
-      </w:r>
-      <w:r>
-        <w:t>lose</w:t>
-      </w:r>
-      <w:r>
-        <w:t>”</w:t>
-      </w:r>
-      <w:r>
-        <w:t xml:space="preserve"> with </w:t>
-      </w:r>
-      <w:r>
-        <w:t>our adoption of AI into our lives.</w:t>
-      </w:r>
-      <w:r>
-        <w:t xml:space="preserve"> Many researchers have recognized this </w:t>
+        <w:t>The ‘Yes Man’ Problem</w:t>
+      </w:r>
+    </w:p>
+    <w:p>
+      <w:r>
+        <w:t xml:space="preserve">Many researchers have recognized this </w:t>
       </w:r>
       <w:r>
         <w:t xml:space="preserve">“smoothness” </w:t>
@@ -476,103 +554,15 @@
     </w:p>
     <w:p>
       <w:r>
-        <w:t xml:space="preserve">In </w:t>
-      </w:r>
-      <w:r>
-        <w:t>trying</w:t>
-      </w:r>
-      <w:r>
-        <w:t xml:space="preserve"> to </w:t>
-      </w:r>
-      <w:r>
-        <w:t>get our hands around the problem</w:t>
-      </w:r>
-      <w:r>
-        <w:t>,</w:t>
-      </w:r>
-      <w:r>
-        <w:t xml:space="preserve"> </w:t>
-      </w:r>
-      <w:r>
-        <w:t>we’ve put</w:t>
-      </w:r>
-      <w:r>
-        <w:t xml:space="preserve"> significant effort</w:t>
-      </w:r>
-      <w:r>
-        <w:t xml:space="preserve"> </w:t>
-      </w:r>
-      <w:r>
-        <w:t>into</w:t>
-      </w:r>
-      <w:r>
-        <w:t xml:space="preserve"> </w:t>
-      </w:r>
-      <w:r>
-        <w:t>“detecting”</w:t>
-      </w:r>
-      <w:r>
-        <w:t xml:space="preserve"> AI</w:t>
-      </w:r>
-      <w:r>
-        <w:t xml:space="preserve"> </w:t>
-      </w:r>
-      <w:r>
-        <w:t>work products</w:t>
-      </w:r>
-      <w:r>
-        <w:t xml:space="preserve"> to provide some kind of training pedigree</w:t>
-      </w:r>
-      <w:r>
-        <w:t xml:space="preserve"> to reduce it</w:t>
-      </w:r>
-      <w:r>
-        <w:t>. Flagging these</w:t>
-      </w:r>
-      <w:r>
-        <w:t xml:space="preserve"> work products</w:t>
-      </w:r>
-      <w:r>
-        <w:t xml:space="preserve">, if </w:t>
+        <w:t xml:space="preserve">New strategies are needed to avoid this trap. We need a mechanism or framework to guide our interactions with AIs away from their natural tendency to be drawn towards the smooth </w:t>
       </w:r>
       <w:proofErr w:type="gramStart"/>
       <w:r>
-        <w:t>it</w:t>
+        <w:t>median</w:t>
       </w:r>
       <w:proofErr w:type="gramEnd"/>
       <w:r>
-        <w:t xml:space="preserve"> can </w:t>
-      </w:r>
-      <w:r>
-        <w:t xml:space="preserve">even </w:t>
-      </w:r>
-      <w:r>
-        <w:t xml:space="preserve">be reliably done going forward, seems fruitless. </w:t>
-      </w:r>
-      <w:r>
-        <w:t xml:space="preserve">Telling a new </w:t>
-      </w:r>
-      <w:proofErr w:type="gramStart"/>
-      <w:r>
-        <w:t>model</w:t>
-      </w:r>
-      <w:proofErr w:type="gramEnd"/>
-      <w:r>
-        <w:t xml:space="preserve"> you are training </w:t>
-      </w:r>
-      <w:r>
-        <w:t xml:space="preserve">to ignore previous AI contributions to the corpus during training </w:t>
-      </w:r>
-      <w:r>
-        <w:t xml:space="preserve">doesn’t change the </w:t>
-      </w:r>
-      <w:r>
-        <w:t xml:space="preserve">fact that the data is out there, “smoother” than before. </w:t>
-      </w:r>
-    </w:p>
-    <w:p>
-      <w:r>
-        <w:t xml:space="preserve">New strategies are needed to avoid this trap. We need a mechanism or framework to guide our interactions with AIs away from their natural tendency to be drawn towards the smooth average and produce outputs that are richer, more diverse and interesting. </w:t>
+        <w:t xml:space="preserve"> and produce outputs that are richer, more diverse and interesting. </w:t>
       </w:r>
       <w:r>
         <w:t xml:space="preserve"> </w:t>
@@ -688,7 +678,7 @@
         <w:t>open-source</w:t>
       </w:r>
       <w:r>
-        <w:t xml:space="preserve"> </w:t>
+        <w:t xml:space="preserve"> R&amp;D </w:t>
       </w:r>
       <w:r>
         <w:t xml:space="preserve">application to explore these ideas. </w:t>
@@ -715,8 +705,16 @@
           <w:rPr>
             <w:rStyle w:val="Hyperlink"/>
           </w:rPr>
-          <w:t>/AI_Talk_Show: A little app to explore using multiple AIs for discussing ideas · GitHub</w:t>
+          <w:t>/</w:t>
         </w:r>
+        <w:proofErr w:type="spellStart"/>
+        <w:r>
+          <w:rPr>
+            <w:rStyle w:val="Hyperlink"/>
+          </w:rPr>
+          <w:t>AI_Talk_Show</w:t>
+        </w:r>
+        <w:proofErr w:type="spellEnd"/>
       </w:hyperlink>
     </w:p>
     <w:p>
@@ -868,7 +866,25 @@
             <w:i/>
             <w:iCs/>
           </w:rPr>
-          <w:t>/AI_Talk_Show · GitHub</w:t>
+          <w:t>/</w:t>
+        </w:r>
+        <w:proofErr w:type="spellStart"/>
+        <w:r>
+          <w:rPr>
+            <w:rStyle w:val="Hyperlink"/>
+            <w:i/>
+            <w:iCs/>
+          </w:rPr>
+          <w:t>AI_Talk_Show</w:t>
+        </w:r>
+        <w:proofErr w:type="spellEnd"/>
+        <w:r>
+          <w:rPr>
+            <w:rStyle w:val="Hyperlink"/>
+            <w:i/>
+            <w:iCs/>
+          </w:rPr>
+          <w:t xml:space="preserve"> · GitHub</w:t>
         </w:r>
       </w:hyperlink>
       <w:r>
@@ -956,15 +972,15 @@
           <w:b/>
           <w:bCs/>
         </w:rPr>
+        <w:t>[Jean]:</w:t>
+      </w:r>
+      <w:r>
+        <w:t xml:space="preserve"> I should be transparent: I couldn't find a specific octopus named "Alex" known for practical jokes. The most famous octopus associated with mischievous pranks is Otto. Let me fold what I did find into the discussion honestly.</w:t>
+      </w:r>
+    </w:p>
+    <w:p>
+      <w:r>
         <w:lastRenderedPageBreak/>
-        <w:t>[Jean]:</w:t>
-      </w:r>
-      <w:r>
-        <w:t xml:space="preserve"> I should be transparent: I couldn't find a specific octopus named "Alex" known for practical jokes. The most famous octopus associated with mischievous pranks is Otto. Let me fold what I did find into the discussion honestly.</w:t>
-      </w:r>
-    </w:p>
-    <w:p>
-      <w:r>
         <w:t xml:space="preserve">Otto, at a German aquarium, learned to short-circuit the light above his tank by squirting water at it — his mischief included throwing stones against the glass, juggling hermit crabs, and rearranging his tank. The moment we must describe a creature's behavior in intentional terms to make sense of </w:t>
       </w:r>
       <w:proofErr w:type="gramStart"/>
@@ -1153,7 +1169,25 @@
             <w:i/>
             <w:iCs/>
           </w:rPr>
-          <w:t>/AI_Talk_Show · GitHub</w:t>
+          <w:t>/</w:t>
+        </w:r>
+        <w:proofErr w:type="spellStart"/>
+        <w:r>
+          <w:rPr>
+            <w:rStyle w:val="Hyperlink"/>
+            <w:i/>
+            <w:iCs/>
+          </w:rPr>
+          <w:t>AI_Talk_Show</w:t>
+        </w:r>
+        <w:proofErr w:type="spellEnd"/>
+        <w:r>
+          <w:rPr>
+            <w:rStyle w:val="Hyperlink"/>
+            <w:i/>
+            <w:iCs/>
+          </w:rPr>
+          <w:t xml:space="preserve"> · GitHub</w:t>
         </w:r>
       </w:hyperlink>
       <w:r>
@@ -1242,7 +1276,6 @@
           <w:i/>
           <w:iCs/>
         </w:rPr>
-        <w:lastRenderedPageBreak/>
         <w:t>"</w:t>
       </w:r>
       <w:proofErr w:type="spellStart"/>
@@ -1293,6 +1326,7 @@
           <w:i/>
           <w:iCs/>
         </w:rPr>
+        <w:lastRenderedPageBreak/>
         <w:t>"Everything."</w:t>
       </w:r>
     </w:p>
@@ -1510,7 +1544,13 @@
         <w:t xml:space="preserve"> </w:t>
       </w:r>
       <w:r>
-        <w:t xml:space="preserve">These experiments lead me towards a rather odd conclusion. We need </w:t>
+        <w:t>These experiments lead me towards a rather odd conclusion. We</w:t>
+      </w:r>
+      <w:r>
+        <w:t xml:space="preserve"> might benefit from</w:t>
+      </w:r>
+      <w:r>
+        <w:t xml:space="preserve"> </w:t>
       </w:r>
       <w:r>
         <w:t xml:space="preserve">entities that push back, entities that challenge </w:t>
@@ -1544,10 +1584,19 @@
       <w:r>
         <w:t xml:space="preserve"> a single swipe of her pragmatism. </w:t>
       </w:r>
-    </w:p>
-    <w:p>
-      <w:r>
-        <w:t xml:space="preserve">These experiments show a couple of things. First, </w:t>
+      <w:r>
+        <w:t xml:space="preserve">She introduced “roughness” into the dialogue. </w:t>
+      </w:r>
+    </w:p>
+    <w:p>
+      <w:r>
+        <w:t xml:space="preserve">These </w:t>
+      </w:r>
+      <w:r>
+        <w:t xml:space="preserve">early </w:t>
+      </w:r>
+      <w:r>
+        <w:t xml:space="preserve">experiments show a couple of things. First, </w:t>
       </w:r>
       <w:r>
         <w:t>friction between A</w:t>
@@ -1556,7 +1605,18 @@
         <w:t>Is</w:t>
       </w:r>
       <w:r>
-        <w:t xml:space="preserve"> working on a problem can produce richer results. Second, </w:t>
+        <w:t xml:space="preserve"> working on a problem </w:t>
+      </w:r>
+      <w:proofErr w:type="gramStart"/>
+      <w:r>
+        <w:t>seem</w:t>
+      </w:r>
+      <w:proofErr w:type="gramEnd"/>
+      <w:r>
+        <w:t xml:space="preserve"> to</w:t>
+      </w:r>
+      <w:r>
+        <w:t xml:space="preserve"> produce richer results. Second, </w:t>
       </w:r>
       <w:r>
         <w:t>the chaos introduced by humans changes the conversational landscape in a significant way</w:t>
@@ -1567,17 +1627,20 @@
     </w:p>
     <w:p>
       <w:r>
+        <w:t>The goal of this project is to begin to explore if there is a more “compl</w:t>
+      </w:r>
+      <w:r>
+        <w:t>e</w:t>
+      </w:r>
+      <w:r>
+        <w:t xml:space="preserve">mentary” way to work with LLMs by introducing a sort of “friction” or “roughness” in the </w:t>
+      </w:r>
+      <w:r>
+        <w:t xml:space="preserve">process that doesn’t always converge towards the smooth mean. LLMs, when used a little differently, might be capable of participating in a more collaborative </w:t>
+      </w:r>
+      <w:r>
         <w:lastRenderedPageBreak/>
-        <w:t>The goal of this project is to begin to explore if there is a more “compl</w:t>
-      </w:r>
-      <w:r>
-        <w:t>e</w:t>
-      </w:r>
-      <w:r>
-        <w:t xml:space="preserve">mentary” way to work with LLMs by introducing a sort of “friction” or “roughness” in the </w:t>
-      </w:r>
-      <w:r>
-        <w:t xml:space="preserve">process that doesn’t always converge towards the smooth mean. LLMs, when used a little differently, might be capable of participating in a more collaborative relationship. I don’t think as quickly or have the same access to information as an LLM, but I can work with one to augment my ability to solve problems in an intellectually defensible manner. </w:t>
+        <w:t xml:space="preserve">relationship. I don’t think as quickly or have the same access to information as an LLM, but I can work with one to augment my ability to solve problems in an intellectually defensible manner. </w:t>
       </w:r>
     </w:p>
     <w:p>
@@ -1645,13 +1708,10 @@
       </w:r>
       <w:proofErr w:type="gramEnd"/>
       <w:r>
-        <w:t xml:space="preserve"> the quest</w:t>
-      </w:r>
-      <w:r>
-        <w:t xml:space="preserve"> I’m on</w:t>
-      </w:r>
-      <w:r>
-        <w:t xml:space="preserve">. </w:t>
+        <w:t xml:space="preserve"> my</w:t>
+      </w:r>
+      <w:r>
+        <w:t xml:space="preserve"> quest. </w:t>
       </w:r>
       <w:r>
         <w:t xml:space="preserve">AI in the form of LLMs is getting smarter, but they are not a substitute </w:t>
@@ -1662,10 +1722,10 @@
       </w:r>
       <w:proofErr w:type="gramEnd"/>
       <w:r>
-        <w:t>, they are at best</w:t>
-      </w:r>
-      <w:r>
-        <w:t>,</w:t>
+        <w:t xml:space="preserve">, they </w:t>
+      </w:r>
+      <w:r>
+        <w:t>can be</w:t>
       </w:r>
       <w:r>
         <w:t xml:space="preserve"> </w:t>
@@ -1775,7 +1835,10 @@
         <w:t xml:space="preserve"> distributed brain and aquatic life </w:t>
       </w:r>
       <w:r>
-        <w:t>has developed</w:t>
+        <w:t>appears to have</w:t>
+      </w:r>
+      <w:r>
+        <w:t xml:space="preserve"> developed</w:t>
       </w:r>
       <w:r>
         <w:t xml:space="preserve"> </w:t>
@@ -1851,7 +1914,7 @@
 </file>
 
 <file path=word/numbering.xml><?xml version="1.0" encoding="utf-8"?>
-<w:numbering xmlns:wpc="http://schemas.microsoft.com/office/word/2010/wordprocessingCanvas" xmlns:cx="http://schemas.microsoft.com/office/drawing/2014/chartex" xmlns:cx1="http://schemas.microsoft.com/office/drawing/2015/9/8/chartex" xmlns:cx2="http://schemas.microsoft.com/office/drawing/2015/10/21/chartex" xmlns:cx3="http://schemas.microsoft.com/office/drawing/2016/5/9/chartex" xmlns:cx4="http://schemas.microsoft.com/office/drawing/2016/5/10/chartex" xmlns:cx5="http://schemas.microsoft.com/office/drawing/2016/5/11/chartex" xmlns:cx6="http://schemas.microsoft.com/office/drawing/2016/5/12/chartex" xmlns:cx7="http://schemas.microsoft.com/office/drawing/2016/5/13/chartex" xmlns:cx8="http://schemas.microsoft.com/office/drawing/2016/5/14/chartex" xmlns:mc="http://schemas.openxmlformats.org/markup-compatibility/2006" xmlns:aink="http://schemas.microsoft.com/office/drawing/2016/ink" xmlns:am3d="http://schemas.microsoft.com/office/drawing/2017/model3d" xmlns:o="urn:schemas-microsoft-com:office:office" xmlns:oel="http://schemas.microsoft.com/office/2019/extlst" xmlns:r="http://schemas.openxmlformats.org/officeDocument/2006/relationships" xmlns:m="http://schemas.openxmlformats.org/officeDocument/2006/math" xmlns:v="urn:schemas-microsoft-com:vml" xmlns:wp14="http://schemas.microsoft.com/office/word/2010/wordprocessingDrawing" xmlns:wp="http://schemas.openxmlformats.org/drawingml/2006/wordprocessingDrawing" xmlns:w10="urn:schemas-microsoft-com:office:word" xmlns:w="http://schemas.openxmlformats.org/wordprocessingml/2006/main" xmlns:w14="http://schemas.microsoft.com/office/word/2010/wordml" xmlns:w15="http://schemas.microsoft.com/office/word/2012/wordml" xmlns:w16cex="http://schemas.microsoft.com/office/word/2018/wordml/cex" xmlns:w16cid="http://schemas.microsoft.com/office/word/2016/wordml/cid" xmlns:w16="http://schemas.microsoft.com/office/word/2018/wordml" xmlns:w16du="http://schemas.microsoft.com/office/word/2023/wordml/word16du" xmlns:w16sdtdh="http://schemas.microsoft.com/office/word/2020/wordml/sdtdatahash" xmlns:w16sdtfl="http://schemas.microsoft.com/office/word/2024/wordml/sdtformatlock" xmlns:w16se="http://schemas.microsoft.com/office/word/2015/wordml/symex" xmlns:wpg="http://schemas.microsoft.com/office/word/2010/wordprocessingGroup" xmlns:wpi="http://schemas.microsoft.com/office/word/2010/wordprocessingInk" xmlns:wne="http://schemas.microsoft.com/office/word/2006/wordml" xmlns:wps="http://schemas.microsoft.com/office/word/2010/wordprocessingShape" mc:Ignorable="w14 w15 w16se w16cid w16 w16cex w16sdtdh w16sdtfl w16du wp14">
+<w:numbering xmlns:wpc="http://schemas.microsoft.com/office/word/2010/wordprocessingCanvas" xmlns:cx="http://schemas.microsoft.com/office/drawing/2014/chartex" xmlns:cx1="http://schemas.microsoft.com/office/drawing/2015/9/8/chartex" xmlns:cx2="http://schemas.microsoft.com/office/drawing/2015/10/21/chartex" xmlns:cx3="http://schemas.microsoft.com/office/drawing/2016/5/9/chartex" xmlns:cx4="http://schemas.microsoft.com/office/drawing/2016/5/10/chartex" xmlns:cx5="http://schemas.microsoft.com/office/drawing/2016/5/11/chartex" xmlns:cx6="http://schemas.microsoft.com/office/drawing/2016/5/12/chartex" xmlns:cx7="http://schemas.microsoft.com/office/drawing/2016/5/13/chartex" xmlns:cx8="http://schemas.microsoft.com/office/drawing/2016/5/14/chartex" xmlns:mc="http://schemas.openxmlformats.org/markup-compatibility/2006" xmlns:aink="http://schemas.microsoft.com/office/drawing/2016/ink" xmlns:am3d="http://schemas.microsoft.com/office/drawing/2017/model3d" xmlns:o="urn:schemas-microsoft-com:office:office" xmlns:oel="http://schemas.microsoft.com/office/2019/extlst" xmlns:r="http://schemas.openxmlformats.org/officeDocument/2006/relationships" xmlns:m="http://schemas.openxmlformats.org/officeDocument/2006/math" xmlns:v="urn:schemas-microsoft-com:vml" xmlns:wp14="http://schemas.microsoft.com/office/word/2010/wordprocessingDrawing" xmlns:wp="http://schemas.openxmlformats.org/drawingml/2006/wordprocessingDrawing" xmlns:w10="urn:schemas-microsoft-com:office:word" xmlns:w="http://schemas.openxmlformats.org/wordprocessingml/2006/main" xmlns:w14="http://schemas.microsoft.com/office/word/2010/wordml" xmlns:w15="http://schemas.microsoft.com/office/word/2012/wordml" xmlns:w16cei="http://schemas.microsoft.com/office/word/2026/wordml/cei" xmlns:w16cex="http://schemas.microsoft.com/office/word/2018/wordml/cex" xmlns:w16cid="http://schemas.microsoft.com/office/word/2016/wordml/cid" xmlns:w16="http://schemas.microsoft.com/office/word/2018/wordml" xmlns:w16du="http://schemas.microsoft.com/office/word/2023/wordml/word16du" xmlns:w16sdtdh="http://schemas.microsoft.com/office/word/2020/wordml/sdtdatahash" xmlns:w16sdtfl="http://schemas.microsoft.com/office/word/2024/wordml/sdtformatlock" xmlns:w16se="http://schemas.microsoft.com/office/word/2015/wordml/symex" xmlns:wpg="http://schemas.microsoft.com/office/word/2010/wordprocessingGroup" xmlns:wpi="http://schemas.microsoft.com/office/word/2010/wordprocessingInk" xmlns:wne="http://schemas.microsoft.com/office/word/2006/wordml" xmlns:wps="http://schemas.microsoft.com/office/word/2010/wordprocessingShape" mc:Ignorable="w14 w15 w16se w16cid w16 w16cex w16sdtdh w16sdtfl w16du wp14">
   <w:abstractNum w:abstractNumId="0" w15:restartNumberingAfterBreak="0">
     <w:nsid w:val="0FDC0B28"/>
     <w:multiLevelType w:val="multilevel"/>

</xml_diff>